<commit_message>
Complete all 17 chapters (guides + decks), timed exams, generic branding
- Study guides for chapters 10-17, all 25+ pages with original figures
- Lecture decks for chapters 10-17, plus expanded ch01-09 to 30-50 varied slides
- Timed midterm/final exam system (exam.html) with completion codes
- Removed UND/Nistler CoBPA branding site-wide for generic instructor use
- Rebuilt ch01 and ch08 guides after Word file locks cleared
</commit_message>
<xml_diff>
--- a/guides/ch08-study-guide.docx
+++ b/guides/ch08-study-guide.docx
@@ -517,6 +517,180 @@
         <w:pStyle w:val="Heading1"/>
       </w:pPr>
       <w:r>
+        <w:t>Deep dive: pricing the ask — anchors, frames, and the honest use of both</w:t>
+      </w:r>
+    </w:p>
+    <w:p>
+      <w:r>
+        <w:t>How a number is presented changes how it is judged, and persuasive writers work with that psychology honestly or lose to those who don’t. Anchoring: the first number in a negotiation or proposal becomes the reference point everything after is judged against (Kahneman, 2011) — which is why the cost-of-doing-nothing belongs BEFORE your price (“duplicate entry burns roughly $31,000 of tech time annually; the system costs $6,800”), and why leaving the anchor to the reader’s imagination surrenders the frame. Relative framing: $6,800 “per year” and “$130 a week” and “about the cost of one external audit finding” are the same number wearing three coats — choose the comparison native to the reader’s mental accounting, and choose truthfully (the “pennies a day” frame on a multi-year commitment is technically true and reads as a trick, which prices your ethos in for free). Loss and gain frames: prospect theory’s central finding — losses loom larger than equivalent gains — means “stop losing 30 tech-hours a month” and “save 30 tech-hours a month” are not the same sentence to a human reader; loss frames move risk-averse audiences harder, and overusing them reads as fearmongering. The ethical line for all three is the one this chapter keeps drawing: frames select among true presentations; they never manufacture false ones. The comparison must hold up when the analyst checks it — because the analyst checks it.</w:t>
+      </w:r>
+    </w:p>
+    <w:p>
+      <w:pPr>
+        <w:pStyle w:val="Heading1"/>
+      </w:pPr>
+      <w:r>
+        <w:t>Deep dive: persuading committees — the multi-reader pitch</w:t>
+      </w:r>
+    </w:p>
+    <w:p>
+      <w:r>
+        <w:t>Proposals increasingly face committees, and committees are not big individuals — they are small political systems with predictable dynamics. The pre-work matters more than the document: Chapter 16’s pre-wiring (individual conversations before the meeting) surfaces each member’s objection while it is still cheap to address, converts the persuadable into co-owners (“building on Dana’s suggestion…” in the proposal itself), and identifies the one member whose skepticism anchors the others. The document then writes to the room’s currencies at once (Chapter 2’s benefit taxonomy, deployed in parallel): the economic case for the budget holder, the operational case for the implementer, the risk case for the chair — each labeled, each findable by its owner in a skim. Committee-specific craft: give the group something to decide, not something to discuss (“approve the pilot” beats “thoughts on automation?” — committees discuss indefinitely and decide only what is framed decidably); anticipate the tabling move (“if more data is wanted, the pilot IS the data gathering” pre-empts the committee’s favorite non-decision); and build the summary page as if it were the only page, because for most members it is. Win the pre-wired members, arm the summary page, and the meeting ratifies what the process already built — which is what experienced proposers mean when they say the meeting is the last step of persuasion, not the first.</w:t>
+      </w:r>
+    </w:p>
+    <w:p>
+      <w:pPr>
+        <w:pStyle w:val="Heading1"/>
+      </w:pPr>
+      <w:r>
+        <w:t>Persuasion workshop: five repairs (answers follow)</w:t>
+      </w:r>
+    </w:p>
+    <w:p>
+      <w:pPr>
+        <w:pStyle w:val="ListNumber"/>
+      </w:pPr>
+      <w:r>
+        <w:t>“Our firm has 47 years of combined experience and a passion for excellence. We offer end-to-end solutions across the full spectrum of your needs. We would welcome the opportunity to discuss how we can add value.”</w:t>
+      </w:r>
+    </w:p>
+    <w:p>
+      <w:pPr>
+        <w:pStyle w:val="ListNumber"/>
+      </w:pPr>
+      <w:r>
+        <w:t>“The new software has 14 major features including customizable dashboards, real-time sync, advanced reporting, mobile access, API integration, and much more!”</w:t>
+      </w:r>
+    </w:p>
+    <w:p>
+      <w:pPr>
+        <w:pStyle w:val="ListNumber"/>
+      </w:pPr>
+      <w:r>
+        <w:t>“You need to approve this by Friday or the whole project fails. There is really no alternative. Everyone agrees this is the only option.”</w:t>
+      </w:r>
+    </w:p>
+    <w:p>
+      <w:pPr>
+        <w:pStyle w:val="ListNumber"/>
+      </w:pPr>
+      <w:r>
+        <w:t>“This proposal will save money, improve morale, increase efficiency, boost quality, enhance our reputation, and position us for the future.”</w:t>
+      </w:r>
+    </w:p>
+    <w:p>
+      <w:pPr>
+        <w:pStyle w:val="ListNumber"/>
+      </w:pPr>
+      <w:r>
+        <w:t>“I know you’re busy and this probably isn’t a priority and I hate to even ask, but if you ever have a spare moment, maybe we could possibly chat about the budget idea sometime?”</w:t>
+      </w:r>
+    </w:p>
+    <w:p>
+      <w:pPr>
+        <w:pStyle w:val="Heading2"/>
+      </w:pPr>
+      <w:r>
+        <w:t>Workshop answers</w:t>
+      </w:r>
+    </w:p>
+    <w:p>
+      <w:pPr>
+        <w:pStyle w:val="ListNumber"/>
+      </w:pPr>
+      <w:r>
+        <w:t>Vendor-view hook, zero reader content: no problem named, no evidence, an ask (“discuss how we can add value”) that costs an hour and promises nothing. Repair: open with THEIR quantified problem, offer one number of proof, ask for thirty minutes with an agenda.</w:t>
+      </w:r>
+    </w:p>
+    <w:p>
+      <w:pPr>
+        <w:pStyle w:val="ListNumber"/>
+      </w:pPr>
+      <w:r>
+        <w:t>A feature tour where a mechanism-to-outcome chain belongs. Repair: pick the ONE feature that serves this reader’s known pain, ladder it to their outcome (“real-time sync means your Friday reconciliation disappears”), park the rest in an attachment.</w:t>
+      </w:r>
+    </w:p>
+    <w:p>
+      <w:pPr>
+        <w:pStyle w:val="ListNumber"/>
+      </w:pPr>
+      <w:r>
+        <w:t>Manufactured scarcity plus false consensus plus reactance bait — three ethos detonations in three sentences (Brehm, 1966: pressure this naked gets tested on principle). Repair: the real deadline with its real reason, the honest alternative and its cost, and the freedom acknowledged (“your call — here’s what each path looks like”).</w:t>
+      </w:r>
+    </w:p>
+    <w:p>
+      <w:pPr>
+        <w:pStyle w:val="ListNumber"/>
+      </w:pPr>
+      <w:r>
+        <w:t>Six unweighted claims — the dilution effect in its natural habitat; the reader averages them into mush. Repair: the best THREE, each with its evidence; cut “enhance our reputation and position us for the future” entirely (rung-one abstractions, Chapter 4).</w:t>
+      </w:r>
+    </w:p>
+    <w:p>
+      <w:pPr>
+        <w:pStyle w:val="ListNumber"/>
+      </w:pPr>
+      <w:r>
+        <w:t>The ask apologized into nonexistence: five hedges, no benefit, no size, no date. Repair: “Fifteen minutes this week on the budget idea? The Q3 numbers make it timely, and I think it saves your team real hours — Thursday afternoon work?” Confidence is not presumption; it is information about whether YOU believe the pitch.</w:t>
+      </w:r>
+    </w:p>
+    <w:p>
+      <w:pPr>
+        <w:pStyle w:val="Heading1"/>
+      </w:pPr>
+      <w:r>
+        <w:t>Templates appendix: three pitches to steal</w:t>
+      </w:r>
+    </w:p>
+    <w:p>
+      <w:r>
+        <w:t>Adapt freely — the structure is the value.</w:t>
+      </w:r>
+    </w:p>
+    <w:p>
+      <w:pPr>
+        <w:pStyle w:val="Heading2"/>
+      </w:pPr>
+      <w:r>
+        <w:t>1. The internal proposal email (full AIDA in one screen)</w:t>
+      </w:r>
+    </w:p>
+    <w:p>
+      <w:r>
+        <w:t>“Subject: Cut duplicate sample entry — pilot proposal (decision by 7/18). Our techs enter every sample twice; at current volume that’s ~400 duplicate entries a week and our most likely audit finding. Barcode intake eliminates the second entry: the Fargo lab’s 90-day pilot cut entry time 41% with zero transcription findings. Cost: $6,800/yr against ~30 tech-hours/month currently burned — payback in about seven weeks. The honest downside: two clunky weeks while it learns our codes; Fargo called week three ‘never going back.’ Ask: approve a 60-day pilot on Line 2 (vendor holds the discount through 7/18). Comparison sheet attached.”</w:t>
+      </w:r>
+    </w:p>
+    <w:p>
+      <w:pPr>
+        <w:pStyle w:val="Heading2"/>
+      </w:pPr>
+      <w:r>
+        <w:t>2. The commitment-ladder opener (cold, external)</w:t>
+      </w:r>
+    </w:p>
+    <w:p>
+      <w:r>
+        <w:t>“Subject: Question about your March webinar on LIMS validation. Dr. Alvarez — your audit-trail segment solved a problem my lab fought all year, except one piece: amendment logs under 21 CFR 11. If you have fifteen minutes in the next two weeks, I’d value your answer — and I’ll send our validation checklist in return, which your team may find useful.” (Their expertise honored, one specific question, reciprocity offered, smallest possible rung.)</w:t>
+      </w:r>
+    </w:p>
+    <w:p>
+      <w:pPr>
+        <w:pStyle w:val="Heading2"/>
+      </w:pPr>
+      <w:r>
+        <w:t>3. The budget defense (persuading to KEEP something)</w:t>
+      </w:r>
+    </w:p>
+    <w:p>
+      <w:r>
+        <w:t>“Before the line item goes: the tutoring center cost $38K last year and retained 61 students who cited it in exit surveys — at $9,400 tuition each, that’s $573K of retained revenue against $38K of cost. Cutting it books the savings this quarter and the losses next fall, where they won’t carry the center’s name. If the budget must give, the evening-hours pilot ($6K) is the honest candidate — details attached.” (Loss frame, earned; the counter-offer that proves good faith.)</w:t>
+      </w:r>
+    </w:p>
+    <w:p>
+      <w:pPr>
+        <w:pStyle w:val="Heading1"/>
+      </w:pPr>
+      <w:r>
         <w:t>Research corner: why fewer, stronger arguments win</w:t>
       </w:r>
     </w:p>
@@ -2046,7 +2220,25 @@
         <w:ind w:left="720" w:hanging="720"/>
       </w:pPr>
       <w:r>
+        <w:t>Brehm, J. W. (1966). A theory of psychological reactance. Academic Press.</w:t>
+      </w:r>
+    </w:p>
+    <w:p>
+      <w:pPr>
+        <w:spacing w:after="160"/>
+        <w:ind w:left="720" w:hanging="720"/>
+      </w:pPr>
+      <w:r>
         <w:t>Cialdini, R. B. (2021). Influence, new and expanded: The psychology of persuasion. Harper Business.</w:t>
+      </w:r>
+    </w:p>
+    <w:p>
+      <w:pPr>
+        <w:spacing w:after="160"/>
+        <w:ind w:left="720" w:hanging="720"/>
+      </w:pPr>
+      <w:r>
+        <w:t>Kahneman, D. (2011). Thinking, fast and slow. Farrar, Straus and Giroux.</w:t>
       </w:r>
     </w:p>
     <w:p>

</xml_diff>